<commit_message>
Drop the JEI publication claim; frame Stock ML as independent research
The stock-prediction paper is a draft for workshop review, not accepted
by the Journal of Emerging Investigators. Remove the JEI status, logo,
link, awards entry, and achievement (22 -> 21) from the content file,
both modes' achievements copy, and the chatbot knowledge base.

Resume regenerated from the generator with the Common App activity
descriptions: Science Olympiad and fencing placements moved from the
activity bullets into Awards & Honors, a ballroom dance activity added,
and every honor listed. DOCX regenerated and PDF re-exported from Word
(1 page).
</commit_message>
<xml_diff>
--- a/public/LeoChangResume_October2026.docx
+++ b/public/LeoChangResume_October2026.docx
@@ -128,7 +128,7 @@
         <w:rPr>
           <w:b/>
         </w:rPr>
-        <w:t>The Spokesman (School Newspaper) — Editor-in-Chief</w:t>
+        <w:t>The Spokesman (School Newspaper) — Editor-in-Chief (11, 12), Online Editor (10), Associate Editor (9)</w:t>
       </w:r>
       <w:r>
         <w:tab/>
@@ -153,7 +153,7 @@
           <w:i w:val="0"/>
           <w:sz w:val="18"/>
         </w:rPr>
-        <w:t>Rose from Associate Editor (9) to Online Editor (10) to Editor-in-Chief (11, 12); lead 11 editors and 36 writers, artists, and photographers, set editorial direction, and run the print and online editions</w:t>
+        <w:t>Four years on staff; lead 11 editors and 36 writers, artists, and photographers; set editorial direction, edit every article, and run the print and online editions</w:t>
       </w:r>
     </w:p>
     <w:p>
@@ -167,7 +167,7 @@
         <w:rPr>
           <w:b/>
         </w:rPr>
-        <w:t>Ti-Ratana Welfare Society — Director, Orphanage Educational Program</w:t>
+        <w:t>Ti-Ratana Welfare Society — Founder &amp; Director, Orphanage Educational Program</w:t>
       </w:r>
       <w:r>
         <w:tab/>
@@ -192,7 +192,7 @@
           <w:i w:val="0"/>
           <w:sz w:val="18"/>
         </w:rPr>
-        <w:t>Founded and run a remote education program for a Kuala Lumpur NGO housing 70+ children: weekly English and science lessons via Zoom for 6+ years (600+ hours) and a fundraiser raising $8,000+ for e-learning tools; featured in Malaysian press</w:t>
+        <w:t>Founded in 2020 and run weekly remote English and science lessons for a Kuala Lumpur NGO housing 70+ orphans: 6+ years, 600+ hours taught, and a fundraiser raising $8,000+ for e-learning tools; featured in Malaysian press</w:t>
       </w:r>
     </w:p>
     <w:p>
@@ -206,7 +206,7 @@
         <w:rPr>
           <w:b/>
         </w:rPr>
-        <w:t>Varsity Fencing Team — Saber Captain (12), Varsity Fencer (9–12)</w:t>
+        <w:t>Science Olympiad — Upper and Middle School Co-Head (11, 12)</w:t>
       </w:r>
       <w:r>
         <w:tab/>
@@ -231,7 +231,7 @@
           <w:i w:val="0"/>
           <w:sz w:val="18"/>
         </w:rPr>
-        <w:t>Four-year varsity starter, fencing since age six; NJSIAA District 6: 2nd Place, Individual &amp; Team (Saber) (2025); run saber practices for new fencers as captain</w:t>
+        <w:t>Lead weekly meetings for 66+ members; coach 23 events; write 20 practice tests/yr; reached States every year; doubled membership to 66+</w:t>
       </w:r>
     </w:p>
     <w:p>
@@ -245,7 +245,7 @@
         <w:rPr>
           <w:b/>
         </w:rPr>
-        <w:t>Science Olympiad — Co-Head (12), Middle School Co-Head (11)</w:t>
+        <w:t>Varsity Fencing Team — Varsity Saber Captain (12), Varsity Fencer (9–11)</w:t>
       </w:r>
       <w:r>
         <w:tab/>
@@ -270,7 +270,46 @@
           <w:i w:val="0"/>
           <w:sz w:val="18"/>
         </w:rPr>
-        <w:t>Helicopter: 3rd Regionals (2025, 2026), 5th NJ States (2025), 4th NJ States (2026); Electric Vehicle: 6th NJ States (2025); run weekly meetings, write practice tests, and mentor younger members</w:t>
+        <w:t>Four-year varsity starter; fencing since age six; run practices 4x/week for 8 new fencers, teach footwork and sparring, coach at 10+ meets/yr</w:t>
+      </w:r>
+    </w:p>
+    <w:p>
+      <w:pPr>
+        <w:tabs>
+          <w:tab w:pos="10656" w:val="right"/>
+        </w:tabs>
+        <w:spacing w:before="40" w:after="0"/>
+      </w:pPr>
+      <w:r>
+        <w:rPr>
+          <w:b/>
+        </w:rPr>
+        <w:t>Ballroom Dance — Competitive Dancer, International Standard (Independent / USA Dance)</w:t>
+      </w:r>
+      <w:r>
+        <w:tab/>
+      </w:r>
+      <w:r>
+        <w:rPr>
+          <w:i/>
+        </w:rPr>
+        <w:t>2014 – Present</w:t>
+      </w:r>
+    </w:p>
+    <w:p>
+      <w:pPr>
+        <w:pStyle w:val="ListBullet"/>
+        <w:spacing w:after="0"/>
+        <w:ind w:left="317" w:hanging="202"/>
+        <w:jc w:val="both"/>
+      </w:pPr>
+      <w:r>
+        <w:rPr>
+          <w:b w:val="0"/>
+          <w:i w:val="0"/>
+          <w:sz w:val="18"/>
+        </w:rPr>
+        <w:t>Dancing for 12 years; compete about 12 times a year in International Standard (5 dances) against adult and Pro-Am fields in 5+ states</w:t>
       </w:r>
     </w:p>
     <w:p>
@@ -405,7 +444,7 @@
           <w:i w:val="0"/>
           <w:sz w:val="18"/>
         </w:rPr>
-        <w:t>Co-founded a web app that turns handwritten notes and PDFs into searchable study resources: OCR, Claude summarization, a social layer, and a student marketplace (Flask, PostgreSQL, AWS S3; 100+ routes)</w:t>
+        <w:t>Co-founded a web app that turns PDS students' class notes, from handwritten scans to PDFs, into searchable AI-summarized study resources; live at napkinnotes.net</w:t>
       </w:r>
     </w:p>
     <w:p>
@@ -444,7 +483,7 @@
           <w:i w:val="0"/>
           <w:sz w:val="18"/>
         </w:rPr>
-        <w:t>Co-developed (3-person team) a wave-based arcade shooter in Godot 4.6 with a time-rewind mechanic, released to 500+ PDS students; built three enemy types, rewind playback, projectile deflection, difficulty scaling, and persistent leaderboards</w:t>
+        <w:t>Co-developed (3-person team) a wave-based arcade shooter in Godot 4.6 around a time-rewind mechanic, released in the browser to 500+ PDS students; built three enemy types, rewind playback, projectile deflection, difficulty scaling, and leaderboards</w:t>
       </w:r>
     </w:p>
     <w:p>
@@ -458,7 +497,7 @@
         <w:rPr>
           <w:b/>
         </w:rPr>
-        <w:t>Stock Price Prediction ML — Lead Researcher &amp; Developer</w:t>
+        <w:t>Stock Price Prediction ML — Lead Researcher, Independent Research</w:t>
       </w:r>
       <w:r>
         <w:tab/>
@@ -483,7 +522,7 @@
           <w:i w:val="0"/>
           <w:sz w:val="18"/>
         </w:rPr>
-        <w:t>Led a study of whether Twitter sentiment improves LSTM stock prediction (AAPL, TSLA, MSFT; 80K-tweet dataset, 21 technical indicators); sentiment raised average RMSE 32%; accepted for publication in the Journal of Emerging Investigators</w:t>
+        <w:t>Led a study testing whether tweets help AI predict stock prices (LSTM; AAPL, TSLA, MSFT); analyzed 80K+ tweets on 3 stocks and found sentiment hurts accuracy (average RMSE +32%); paper drafted for workshop review</w:t>
       </w:r>
     </w:p>
     <w:p>
@@ -515,7 +554,7 @@
         <w:rPr>
           <w:b/>
         </w:rPr>
-        <w:t>Rutgers University — Research Intern, LLM Multi-Agent Systems (Prof. Yongfeng Zhang)</w:t>
+        <w:t>Rutgers University, Department of Computer Science — Research Intern, Agentic AI (Prof. Yongfeng Zhang)</w:t>
       </w:r>
       <w:r>
         <w:tab/>
@@ -540,7 +579,7 @@
           <w:i w:val="0"/>
           <w:sz w:val="18"/>
         </w:rPr>
-        <w:t>Researched whether LLM agents can negotiate peer-to-peer to fairly ration energy during grid outages; built a 30-household microgrid simulator and agent negotiation layer; paper drafted for an AAAI-27 workshop</w:t>
+        <w:t>Tested whether teams of LLM agents can negotiate power-sharing across 30 homes during blackouts; built the microgrid simulator and agent negotiation layer; paper drafted for an AAAI-27 workshop</w:t>
       </w:r>
     </w:p>
     <w:p>
@@ -579,7 +618,7 @@
           <w:i w:val="0"/>
           <w:sz w:val="18"/>
         </w:rPr>
-        <w:t>Investigated shape memory alloy fibers in concrete for post-earthquake crack closure; ran daily experiments with graduate students and built simulations analyzing the resulting test data</w:t>
+        <w:t>Tested how shape memory alloys strengthen concrete against earthquakes; ran daily lab experiments with graduate students and built computer simulations of my own test results</w:t>
       </w:r>
     </w:p>
     <w:p>
@@ -593,7 +632,7 @@
         <w:rPr>
           <w:b/>
         </w:rPr>
-        <w:t>Zhongke Guoguang Quantum (GGQuanta) — AI/ML Intern, Multi-Agent Systems &amp; Web</w:t>
+        <w:t>Zhongke Guoguang Quantum (GGQuanta) — AI/ML Research &amp; Web Development Intern</w:t>
       </w:r>
       <w:r>
         <w:tab/>
@@ -618,7 +657,7 @@
           <w:i w:val="0"/>
           <w:sz w:val="18"/>
         </w:rPr>
-        <w:t>Authored and stress-tested agent skills for QuantaMate, the AI research assistant of China's first photonic quantum chip company (shipped at its July 2026 launch); developed its production bilingual website with an interactive 3D chip model</w:t>
+        <w:t>Authored and stress-tested AI agent skills for QuantaMate, the research assistant of China's first photonic quantum chip company (shipped at its July 2026 launch); developed its production English-Chinese website with an interactive 3D chip model</w:t>
       </w:r>
     </w:p>
     <w:p>
@@ -657,7 +696,7 @@
           <w:i w:val="0"/>
           <w:sz w:val="18"/>
         </w:rPr>
-        <w:t>Led a full website redesign with the CEO: competitor analysis of 10+ sites, all major web content, and social media</w:t>
+        <w:t>Led a full website redesign with the CEO, including competitor analysis of 10+ sites, all major web content, and the firm's social media</w:t>
       </w:r>
     </w:p>
     <w:p>
@@ -671,7 +710,7 @@
         <w:rPr>
           <w:b/>
         </w:rPr>
-        <w:t>Chipotle Mexican Grill — Team Member, Yardley &amp; Warrington, PA</w:t>
+        <w:t>Chipotle Mexican Grill — Crew Member, Counter Service &amp; Online-Order Prep</w:t>
       </w:r>
       <w:r>
         <w:tab/>
@@ -680,7 +719,7 @@
         <w:rPr>
           <w:i/>
         </w:rPr>
-        <w:t>Sep 2025 – May 2026</w:t>
+        <w:t>Yardley &amp; Warrington, PA | Sep 2025 – May 2026</w:t>
       </w:r>
     </w:p>
     <w:p>
@@ -696,7 +735,7 @@
           <w:i w:val="0"/>
           <w:sz w:val="18"/>
         </w:rPr>
-        <w:t>Built 200+ orders daily through peak rushes; upheld food-safety protocols and coordinated shift transitions</w:t>
+        <w:t>Worked the school year through 200-order dinner rushes; built orders at the counter and for online/app pickup; covered any station needed</w:t>
       </w:r>
     </w:p>
     <w:p>
@@ -735,7 +774,7 @@
           <w:i w:val="0"/>
           <w:sz w:val="18"/>
         </w:rPr>
-        <w:t>Authored 15+ published blog posts and guest articles for an online exam-prep company</w:t>
+        <w:t>Wrote 15+ published blog posts and guest articles for an online exam-prep company</w:t>
       </w:r>
     </w:p>
     <w:p>
@@ -774,7 +813,7 @@
           <w:i w:val="0"/>
           <w:sz w:val="18"/>
         </w:rPr>
-        <w:t>66+ hours of nursing-unit support: patient cart programs, patient support, data entry, and discharge-packet preparation</w:t>
+        <w:t>66+ hours in the nursing units: patient cart programs, patient support, data entry, and discharge packets</w:t>
       </w:r>
     </w:p>
     <w:p>
@@ -792,7 +831,7 @@
           <w:b/>
           <w:sz w:val="21"/>
         </w:rPr>
-        <w:t>AWARDS &amp; PUBLICATIONS</w:t>
+        <w:t>AWARDS &amp; HONORS</w:t>
       </w:r>
     </w:p>
     <w:p>
@@ -808,7 +847,7 @@
           <w:i w:val="0"/>
           <w:sz w:val="18"/>
         </w:rPr>
-        <w:t>PClassic Fall 2023: 1st Place</w:t>
+        <w:t>Athletics:</w:t>
       </w:r>
       <w:r>
         <w:rPr>
@@ -816,79 +855,7 @@
           <w:i w:val="0"/>
           <w:sz w:val="18"/>
         </w:rPr>
-        <w:t xml:space="preserve"> — UPenn competitive programming competition</w:t>
-      </w:r>
-    </w:p>
-    <w:p>
-      <w:pPr>
-        <w:pStyle w:val="ListBullet"/>
-        <w:spacing w:after="0"/>
-        <w:ind w:left="317" w:hanging="202"/>
-        <w:jc w:val="both"/>
-      </w:pPr>
-      <w:r>
-        <w:rPr>
-          <w:b/>
-          <w:i w:val="0"/>
-          <w:sz w:val="18"/>
-        </w:rPr>
-        <w:t>HackBac Hackathon: 3rd Place (2024)</w:t>
-      </w:r>
-      <w:r>
-        <w:rPr>
-          <w:b w:val="0"/>
-          <w:i w:val="0"/>
-          <w:sz w:val="18"/>
-        </w:rPr>
-        <w:t xml:space="preserve"> — social justice-themed hackathon</w:t>
-      </w:r>
-    </w:p>
-    <w:p>
-      <w:pPr>
-        <w:pStyle w:val="ListBullet"/>
-        <w:spacing w:after="0"/>
-        <w:ind w:left="317" w:hanging="202"/>
-        <w:jc w:val="both"/>
-      </w:pPr>
-      <w:r>
-        <w:rPr>
-          <w:b/>
-          <w:i w:val="0"/>
-          <w:sz w:val="18"/>
-        </w:rPr>
-        <w:t>Ballroom Dance:</w:t>
-      </w:r>
-      <w:r>
-        <w:rPr>
-          <w:b w:val="0"/>
-          <w:i w:val="0"/>
-          <w:sz w:val="18"/>
-        </w:rPr>
-        <w:t xml:space="preserve"> USA Dance Youth Pre-Champ National Champion (2025); Embassy Ball World Pro/Am Finalist (2026); USDC Pro-Am National Finalist (2024 – 3rd, 2025, 2026)</w:t>
-      </w:r>
-    </w:p>
-    <w:p>
-      <w:pPr>
-        <w:pStyle w:val="ListBullet"/>
-        <w:spacing w:after="0"/>
-        <w:ind w:left="317" w:hanging="202"/>
-        <w:jc w:val="both"/>
-      </w:pPr>
-      <w:r>
-        <w:rPr>
-          <w:b/>
-          <w:i w:val="0"/>
-          <w:sz w:val="18"/>
-        </w:rPr>
-        <w:t>Journal of Emerging Investigators:</w:t>
-      </w:r>
-      <w:r>
-        <w:rPr>
-          <w:b w:val="0"/>
-          <w:i w:val="0"/>
-          <w:sz w:val="18"/>
-        </w:rPr>
-        <w:t xml:space="preserve"> Paper accepted (2025) — “Analyzing the Impact of Twitter Sentiment on Stock Price Prediction Using Long Short-Term Memory Models”</w:t>
+        <w:t xml:space="preserve"> USA Dance National Youth Pre-Champ Standard Champion (2025); Embassy Ball World Pro/Am Finalist (2026); USDC Pro-Am National Finalist (3rd in 2024; finalist 2025, 2026); NJSIAA District 6 Fencing 2nd Place, Individual &amp; Team Saber (2025)</w:t>
       </w:r>
     </w:p>
     <w:p>
@@ -912,7 +879,7 @@
           <w:i w:val="0"/>
           <w:sz w:val="18"/>
         </w:rPr>
-        <w:t xml:space="preserve"> Progressive Young Artist Awards Gold Medal — “Dear Lao-Lao” (2026); 2 Scholastic Silver Keys for poetry — “My Grandfather’s Voice” (2023), “Legacy” (2024); poetry published in White Enso (“Six Winter Haiku”, 2024) and Creative Communication (2023)</w:t>
+        <w:t xml:space="preserve"> Progressive Young Artist Awards Gold Medal — “Dear Lao-Lao” (2026); Scholastic Silver Keys for poetry — “My Grandfather’s Voice” (2023), “Legacy” (2024); poetry in White Enso (“Six Winter Haiku”, 2024) and Creative Communication (2023)</w:t>
       </w:r>
     </w:p>
     <w:p>
@@ -928,7 +895,7 @@
           <w:i w:val="0"/>
           <w:sz w:val="18"/>
         </w:rPr>
-        <w:t>National Economics Challenge:</w:t>
+        <w:t>Science Olympiad:</w:t>
       </w:r>
       <w:r>
         <w:rPr>
@@ -936,7 +903,31 @@
           <w:i w:val="0"/>
           <w:sz w:val="18"/>
         </w:rPr>
-        <w:t xml:space="preserve"> 4th, California State Finals 2024 (as a freshman)</w:t>
+        <w:t xml:space="preserve"> NJ States: 4th Helicopter (2026), 5th Helicopter and 6th Electric Vehicle (2025); Regionals: 3rd Helicopter (2025, 2026)</w:t>
+      </w:r>
+    </w:p>
+    <w:p>
+      <w:pPr>
+        <w:pStyle w:val="ListBullet"/>
+        <w:spacing w:after="0"/>
+        <w:ind w:left="317" w:hanging="202"/>
+        <w:jc w:val="both"/>
+      </w:pPr>
+      <w:r>
+        <w:rPr>
+          <w:b/>
+          <w:i w:val="0"/>
+          <w:sz w:val="18"/>
+        </w:rPr>
+        <w:t>Competitions:</w:t>
+      </w:r>
+      <w:r>
+        <w:rPr>
+          <w:b w:val="0"/>
+          <w:i w:val="0"/>
+          <w:sz w:val="18"/>
+        </w:rPr>
+        <w:t xml:space="preserve"> PClassic Fall 2023 1st Place (UPenn competitive programming contest); National Economics Challenge 4th Place, California State Finals 2024 (as a freshman); HackBac Hackathon 3rd Place (2024, social justice-themed)</w:t>
       </w:r>
     </w:p>
     <w:p>

</xml_diff>